<commit_message>
feat: upgrade ML pipeline with hyperparameter tuning, stacking ensemble, and clinical calibration
</commit_message>
<xml_diff>
--- a/CardioAI_Term_Paper_Benedict_Baah.docx
+++ b/CardioAI_Term_Paper_Benedict_Baah.docx
@@ -10,25 +10,11 @@
         <w:rPr>
           <w:b/>
           <w:color w:val="B41414"/>
-          <w:sz w:val="26"/>
-        </w:rPr>
-        <w:t>OSIRI UNIVERSITY, NEBRASKA, USA</w:t>
-        <w:br/>
-        <w:t>DEPARTMENT OF COMPUTER SCIENCE &amp; ARTIFICIAL INTELLIGENCE</w:t>
-      </w:r>
-    </w:p>
-    <w:p>
-      <w:pPr>
-        <w:jc w:val="center"/>
-      </w:pPr>
-      <w:r>
-        <w:rPr>
-          <w:b/>
-          <w:sz w:val="22"/>
+          <w:sz w:val="24"/>
         </w:rPr>
         <w:t>APPLICATION ASSESSMENT : MACHINE LEARNING RESEARCH AND APPLICATION DEVELOPMENT</w:t>
         <w:br/>
-        <w:t>PART 1: COMPREHENSIVE RESEARCH TERM PAPER</w:t>
+        <w:t>COMPREHENSIVE RESEARCH TERM PAPER</w:t>
       </w:r>
     </w:p>
     <w:p>
@@ -55,9 +41,9 @@
           <w:i/>
           <w:sz w:val="21"/>
         </w:rPr>
-        <w:t>Researcher / Author: Benedict Baah (benbaah@osiriuniversity.org | +233 245759765)</w:t>
+        <w:t>Researcher / Author: Benedict Baah (+233 245759765)</w:t>
         <w:br/>
-        <w:t>Faculty Advisor / Research Supervisor: Dr. Timothy Ogunleye</w:t>
+        <w:t>Research Supervisor: Dr. Timothy A Ogunleye</w:t>
         <w:br/>
         <w:t>GitHub Repository: https://github.com/BenedictBen/heart-disease-prediction</w:t>
         <w:br/>
@@ -1535,7 +1521,7 @@
               <w:rPr>
                 <w:sz w:val="18"/>
               </w:rPr>
-              <w:t>LightGBM</w:t>
+              <w:t>Random_Forest</w:t>
             </w:r>
           </w:p>
         </w:tc>
@@ -1555,7 +1541,7 @@
               <w:rPr>
                 <w:sz w:val="18"/>
               </w:rPr>
-              <w:t>95.56%</w:t>
+              <w:t>96.43%</w:t>
             </w:r>
           </w:p>
         </w:tc>
@@ -1575,7 +1561,7 @@
               <w:rPr>
                 <w:sz w:val="18"/>
               </w:rPr>
-              <w:t>88.52%</w:t>
+              <w:t>90.16%</w:t>
             </w:r>
           </w:p>
         </w:tc>
@@ -1615,6 +1601,283 @@
               <w:rPr>
                 <w:sz w:val="18"/>
               </w:rPr>
+              <w:t>87.88%</w:t>
+            </w:r>
+          </w:p>
+        </w:tc>
+        <w:tc>
+          <w:tcPr>
+            <w:tcW w:type="dxa" w:w="1152"/>
+            <w:shd w:fill="F2F5FA"/>
+            <w:tcMar>
+              <w:top w:w="80" w:type="dxa"/>
+              <w:bottom w:w="80" w:type="dxa"/>
+              <w:left w:w="100" w:type="dxa"/>
+              <w:right w:w="100" w:type="dxa"/>
+            </w:tcMar>
+          </w:tcPr>
+          <w:p>
+            <w:r>
+              <w:rPr>
+                <w:sz w:val="18"/>
+              </w:rPr>
+              <w:t>0.8966</w:t>
+            </w:r>
+          </w:p>
+        </w:tc>
+        <w:tc>
+          <w:tcPr>
+            <w:tcW w:type="dxa" w:w="1584"/>
+            <w:shd w:fill="F2F5FA"/>
+            <w:tcMar>
+              <w:top w:w="80" w:type="dxa"/>
+              <w:bottom w:w="80" w:type="dxa"/>
+              <w:left w:w="100" w:type="dxa"/>
+              <w:right w:w="100" w:type="dxa"/>
+            </w:tcMar>
+          </w:tcPr>
+          <w:p>
+            <w:r>
+              <w:rPr>
+                <w:sz w:val="18"/>
+              </w:rPr>
+              <w:t>81.4% ± 2.8%</w:t>
+            </w:r>
+          </w:p>
+        </w:tc>
+      </w:tr>
+      <w:tr>
+        <w:tc>
+          <w:tcPr>
+            <w:tcW w:type="dxa" w:w="2592"/>
+            <w:tcMar>
+              <w:top w:w="80" w:type="dxa"/>
+              <w:bottom w:w="80" w:type="dxa"/>
+              <w:left w:w="100" w:type="dxa"/>
+              <w:right w:w="100" w:type="dxa"/>
+            </w:tcMar>
+          </w:tcPr>
+          <w:p>
+            <w:r>
+              <w:rPr>
+                <w:sz w:val="18"/>
+              </w:rPr>
+              <w:t>Stacking_Classifier</w:t>
+            </w:r>
+          </w:p>
+        </w:tc>
+        <w:tc>
+          <w:tcPr>
+            <w:tcW w:type="dxa" w:w="1152"/>
+            <w:tcMar>
+              <w:top w:w="80" w:type="dxa"/>
+              <w:bottom w:w="80" w:type="dxa"/>
+              <w:left w:w="100" w:type="dxa"/>
+              <w:right w:w="100" w:type="dxa"/>
+            </w:tcMar>
+          </w:tcPr>
+          <w:p>
+            <w:r>
+              <w:rPr>
+                <w:sz w:val="18"/>
+              </w:rPr>
+              <w:t>95.89%</w:t>
+            </w:r>
+          </w:p>
+        </w:tc>
+        <w:tc>
+          <w:tcPr>
+            <w:tcW w:type="dxa" w:w="1152"/>
+            <w:tcMar>
+              <w:top w:w="80" w:type="dxa"/>
+              <w:bottom w:w="80" w:type="dxa"/>
+              <w:left w:w="100" w:type="dxa"/>
+              <w:right w:w="100" w:type="dxa"/>
+            </w:tcMar>
+          </w:tcPr>
+          <w:p>
+            <w:r>
+              <w:rPr>
+                <w:sz w:val="18"/>
+              </w:rPr>
+              <w:t>86.89%</w:t>
+            </w:r>
+          </w:p>
+        </w:tc>
+        <w:tc>
+          <w:tcPr>
+            <w:tcW w:type="dxa" w:w="1296"/>
+            <w:tcMar>
+              <w:top w:w="80" w:type="dxa"/>
+              <w:bottom w:w="80" w:type="dxa"/>
+              <w:left w:w="100" w:type="dxa"/>
+              <w:right w:w="100" w:type="dxa"/>
+            </w:tcMar>
+          </w:tcPr>
+          <w:p>
+            <w:r>
+              <w:rPr>
+                <w:sz w:val="18"/>
+              </w:rPr>
+              <w:t>92.86%</w:t>
+            </w:r>
+          </w:p>
+        </w:tc>
+        <w:tc>
+          <w:tcPr>
+            <w:tcW w:type="dxa" w:w="1152"/>
+            <w:tcMar>
+              <w:top w:w="80" w:type="dxa"/>
+              <w:bottom w:w="80" w:type="dxa"/>
+              <w:left w:w="100" w:type="dxa"/>
+              <w:right w:w="100" w:type="dxa"/>
+            </w:tcMar>
+          </w:tcPr>
+          <w:p>
+            <w:r>
+              <w:rPr>
+                <w:sz w:val="18"/>
+              </w:rPr>
+              <w:t>81.82%</w:t>
+            </w:r>
+          </w:p>
+        </w:tc>
+        <w:tc>
+          <w:tcPr>
+            <w:tcW w:type="dxa" w:w="1152"/>
+            <w:tcMar>
+              <w:top w:w="80" w:type="dxa"/>
+              <w:bottom w:w="80" w:type="dxa"/>
+              <w:left w:w="100" w:type="dxa"/>
+              <w:right w:w="100" w:type="dxa"/>
+            </w:tcMar>
+          </w:tcPr>
+          <w:p>
+            <w:r>
+              <w:rPr>
+                <w:sz w:val="18"/>
+              </w:rPr>
+              <w:t>0.8667</w:t>
+            </w:r>
+          </w:p>
+        </w:tc>
+        <w:tc>
+          <w:tcPr>
+            <w:tcW w:type="dxa" w:w="1584"/>
+            <w:tcMar>
+              <w:top w:w="80" w:type="dxa"/>
+              <w:bottom w:w="80" w:type="dxa"/>
+              <w:left w:w="100" w:type="dxa"/>
+              <w:right w:w="100" w:type="dxa"/>
+            </w:tcMar>
+          </w:tcPr>
+          <w:p>
+            <w:r>
+              <w:rPr>
+                <w:sz w:val="18"/>
+              </w:rPr>
+              <w:t>82.6% ± 3.2%</w:t>
+            </w:r>
+          </w:p>
+        </w:tc>
+      </w:tr>
+      <w:tr>
+        <w:tc>
+          <w:tcPr>
+            <w:tcW w:type="dxa" w:w="2592"/>
+            <w:shd w:fill="F2F5FA"/>
+            <w:tcMar>
+              <w:top w:w="80" w:type="dxa"/>
+              <w:bottom w:w="80" w:type="dxa"/>
+              <w:left w:w="100" w:type="dxa"/>
+              <w:right w:w="100" w:type="dxa"/>
+            </w:tcMar>
+          </w:tcPr>
+          <w:p>
+            <w:r>
+              <w:rPr>
+                <w:sz w:val="18"/>
+              </w:rPr>
+              <w:t>LightGBM</w:t>
+            </w:r>
+          </w:p>
+        </w:tc>
+        <w:tc>
+          <w:tcPr>
+            <w:tcW w:type="dxa" w:w="1152"/>
+            <w:shd w:fill="F2F5FA"/>
+            <w:tcMar>
+              <w:top w:w="80" w:type="dxa"/>
+              <w:bottom w:w="80" w:type="dxa"/>
+              <w:left w:w="100" w:type="dxa"/>
+              <w:right w:w="100" w:type="dxa"/>
+            </w:tcMar>
+          </w:tcPr>
+          <w:p>
+            <w:r>
+              <w:rPr>
+                <w:sz w:val="18"/>
+              </w:rPr>
+              <w:t>95.67%</w:t>
+            </w:r>
+          </w:p>
+        </w:tc>
+        <w:tc>
+          <w:tcPr>
+            <w:tcW w:type="dxa" w:w="1152"/>
+            <w:shd w:fill="F2F5FA"/>
+            <w:tcMar>
+              <w:top w:w="80" w:type="dxa"/>
+              <w:bottom w:w="80" w:type="dxa"/>
+              <w:left w:w="100" w:type="dxa"/>
+              <w:right w:w="100" w:type="dxa"/>
+            </w:tcMar>
+          </w:tcPr>
+          <w:p>
+            <w:r>
+              <w:rPr>
+                <w:sz w:val="18"/>
+              </w:rPr>
+              <w:t>86.89%</w:t>
+            </w:r>
+          </w:p>
+        </w:tc>
+        <w:tc>
+          <w:tcPr>
+            <w:tcW w:type="dxa" w:w="1296"/>
+            <w:shd w:fill="F2F5FA"/>
+            <w:tcMar>
+              <w:top w:w="80" w:type="dxa"/>
+              <w:bottom w:w="80" w:type="dxa"/>
+              <w:left w:w="100" w:type="dxa"/>
+              <w:right w:w="100" w:type="dxa"/>
+            </w:tcMar>
+          </w:tcPr>
+          <w:p>
+            <w:r>
+              <w:rPr>
+                <w:sz w:val="18"/>
+              </w:rPr>
+              <w:t>89.29%</w:t>
+            </w:r>
+          </w:p>
+        </w:tc>
+        <w:tc>
+          <w:tcPr>
+            <w:tcW w:type="dxa" w:w="1152"/>
+            <w:shd w:fill="F2F5FA"/>
+            <w:tcMar>
+              <w:top w:w="80" w:type="dxa"/>
+              <w:bottom w:w="80" w:type="dxa"/>
+              <w:left w:w="100" w:type="dxa"/>
+              <w:right w:w="100" w:type="dxa"/>
+            </w:tcMar>
+          </w:tcPr>
+          <w:p>
+            <w:r>
+              <w:rPr>
+                <w:sz w:val="18"/>
+              </w:rPr>
               <w:t>84.85%</w:t>
             </w:r>
           </w:p>
@@ -1635,7 +1898,7 @@
               <w:rPr>
                 <w:sz w:val="18"/>
               </w:rPr>
-              <w:t>0.8814</w:t>
+              <w:t>0.8621</w:t>
             </w:r>
           </w:p>
         </w:tc>
@@ -1655,7 +1918,7 @@
               <w:rPr>
                 <w:sz w:val="18"/>
               </w:rPr>
-              <w:t>78.5% ± 3.5%</w:t>
+              <w:t>82.2% ± 3.9%</w:t>
             </w:r>
           </w:p>
         </w:tc>
@@ -1953,284 +2216,7 @@
               <w:rPr>
                 <w:sz w:val="18"/>
               </w:rPr>
-              <w:t>CatBoost</w:t>
-            </w:r>
-          </w:p>
-        </w:tc>
-        <w:tc>
-          <w:tcPr>
-            <w:tcW w:type="dxa" w:w="1152"/>
-            <w:tcMar>
-              <w:top w:w="80" w:type="dxa"/>
-              <w:bottom w:w="80" w:type="dxa"/>
-              <w:left w:w="100" w:type="dxa"/>
-              <w:right w:w="100" w:type="dxa"/>
-            </w:tcMar>
-          </w:tcPr>
-          <w:p>
-            <w:r>
-              <w:rPr>
-                <w:sz w:val="18"/>
-              </w:rPr>
-              <w:t>95.13%</w:t>
-            </w:r>
-          </w:p>
-        </w:tc>
-        <w:tc>
-          <w:tcPr>
-            <w:tcW w:type="dxa" w:w="1152"/>
-            <w:tcMar>
-              <w:top w:w="80" w:type="dxa"/>
-              <w:bottom w:w="80" w:type="dxa"/>
-              <w:left w:w="100" w:type="dxa"/>
-              <w:right w:w="100" w:type="dxa"/>
-            </w:tcMar>
-          </w:tcPr>
-          <w:p>
-            <w:r>
-              <w:rPr>
-                <w:sz w:val="18"/>
-              </w:rPr>
-              <w:t>90.16%</w:t>
-            </w:r>
-          </w:p>
-        </w:tc>
-        <w:tc>
-          <w:tcPr>
-            <w:tcW w:type="dxa" w:w="1296"/>
-            <w:tcMar>
-              <w:top w:w="80" w:type="dxa"/>
-              <w:bottom w:w="80" w:type="dxa"/>
-              <w:left w:w="100" w:type="dxa"/>
-              <w:right w:w="100" w:type="dxa"/>
-            </w:tcMar>
-          </w:tcPr>
-          <w:p>
-            <w:r>
-              <w:rPr>
-                <w:sz w:val="18"/>
-              </w:rPr>
-              <w:t>92.86%</w:t>
-            </w:r>
-          </w:p>
-        </w:tc>
-        <w:tc>
-          <w:tcPr>
-            <w:tcW w:type="dxa" w:w="1152"/>
-            <w:tcMar>
-              <w:top w:w="80" w:type="dxa"/>
-              <w:bottom w:w="80" w:type="dxa"/>
-              <w:left w:w="100" w:type="dxa"/>
-              <w:right w:w="100" w:type="dxa"/>
-            </w:tcMar>
-          </w:tcPr>
-          <w:p>
-            <w:r>
-              <w:rPr>
-                <w:sz w:val="18"/>
-              </w:rPr>
-              <w:t>87.88%</w:t>
-            </w:r>
-          </w:p>
-        </w:tc>
-        <w:tc>
-          <w:tcPr>
-            <w:tcW w:type="dxa" w:w="1152"/>
-            <w:tcMar>
-              <w:top w:w="80" w:type="dxa"/>
-              <w:bottom w:w="80" w:type="dxa"/>
-              <w:left w:w="100" w:type="dxa"/>
-              <w:right w:w="100" w:type="dxa"/>
-            </w:tcMar>
-          </w:tcPr>
-          <w:p>
-            <w:r>
-              <w:rPr>
-                <w:sz w:val="18"/>
-              </w:rPr>
-              <w:t>0.8966</w:t>
-            </w:r>
-          </w:p>
-        </w:tc>
-        <w:tc>
-          <w:tcPr>
-            <w:tcW w:type="dxa" w:w="1584"/>
-            <w:tcMar>
-              <w:top w:w="80" w:type="dxa"/>
-              <w:bottom w:w="80" w:type="dxa"/>
-              <w:left w:w="100" w:type="dxa"/>
-              <w:right w:w="100" w:type="dxa"/>
-            </w:tcMar>
-          </w:tcPr>
-          <w:p>
-            <w:r>
-              <w:rPr>
-                <w:sz w:val="18"/>
-              </w:rPr>
-              <w:t>80.5% ± 3.7%</w:t>
-            </w:r>
-          </w:p>
-        </w:tc>
-      </w:tr>
-      <w:tr>
-        <w:tc>
-          <w:tcPr>
-            <w:tcW w:type="dxa" w:w="2592"/>
-            <w:shd w:fill="F2F5FA"/>
-            <w:tcMar>
-              <w:top w:w="80" w:type="dxa"/>
-              <w:bottom w:w="80" w:type="dxa"/>
-              <w:left w:w="100" w:type="dxa"/>
-              <w:right w:w="100" w:type="dxa"/>
-            </w:tcMar>
-          </w:tcPr>
-          <w:p>
-            <w:r>
-              <w:rPr>
-                <w:sz w:val="18"/>
-              </w:rPr>
-              <w:t>Random_Forest</w:t>
-            </w:r>
-          </w:p>
-        </w:tc>
-        <w:tc>
-          <w:tcPr>
-            <w:tcW w:type="dxa" w:w="1152"/>
-            <w:shd w:fill="F2F5FA"/>
-            <w:tcMar>
-              <w:top w:w="80" w:type="dxa"/>
-              <w:bottom w:w="80" w:type="dxa"/>
-              <w:left w:w="100" w:type="dxa"/>
-              <w:right w:w="100" w:type="dxa"/>
-            </w:tcMar>
-          </w:tcPr>
-          <w:p>
-            <w:r>
-              <w:rPr>
-                <w:sz w:val="18"/>
-              </w:rPr>
-              <w:t>95.02%</w:t>
-            </w:r>
-          </w:p>
-        </w:tc>
-        <w:tc>
-          <w:tcPr>
-            <w:tcW w:type="dxa" w:w="1152"/>
-            <w:shd w:fill="F2F5FA"/>
-            <w:tcMar>
-              <w:top w:w="80" w:type="dxa"/>
-              <w:bottom w:w="80" w:type="dxa"/>
-              <w:left w:w="100" w:type="dxa"/>
-              <w:right w:w="100" w:type="dxa"/>
-            </w:tcMar>
-          </w:tcPr>
-          <w:p>
-            <w:r>
-              <w:rPr>
-                <w:sz w:val="18"/>
-              </w:rPr>
-              <w:t>90.16%</w:t>
-            </w:r>
-          </w:p>
-        </w:tc>
-        <w:tc>
-          <w:tcPr>
-            <w:tcW w:type="dxa" w:w="1296"/>
-            <w:shd w:fill="F2F5FA"/>
-            <w:tcMar>
-              <w:top w:w="80" w:type="dxa"/>
-              <w:bottom w:w="80" w:type="dxa"/>
-              <w:left w:w="100" w:type="dxa"/>
-              <w:right w:w="100" w:type="dxa"/>
-            </w:tcMar>
-          </w:tcPr>
-          <w:p>
-            <w:r>
-              <w:rPr>
-                <w:sz w:val="18"/>
-              </w:rPr>
-              <w:t>96.43%</w:t>
-            </w:r>
-          </w:p>
-        </w:tc>
-        <w:tc>
-          <w:tcPr>
-            <w:tcW w:type="dxa" w:w="1152"/>
-            <w:shd w:fill="F2F5FA"/>
-            <w:tcMar>
-              <w:top w:w="80" w:type="dxa"/>
-              <w:bottom w:w="80" w:type="dxa"/>
-              <w:left w:w="100" w:type="dxa"/>
-              <w:right w:w="100" w:type="dxa"/>
-            </w:tcMar>
-          </w:tcPr>
-          <w:p>
-            <w:r>
-              <w:rPr>
-                <w:sz w:val="18"/>
-              </w:rPr>
-              <w:t>84.85%</w:t>
-            </w:r>
-          </w:p>
-        </w:tc>
-        <w:tc>
-          <w:tcPr>
-            <w:tcW w:type="dxa" w:w="1152"/>
-            <w:shd w:fill="F2F5FA"/>
-            <w:tcMar>
-              <w:top w:w="80" w:type="dxa"/>
-              <w:bottom w:w="80" w:type="dxa"/>
-              <w:left w:w="100" w:type="dxa"/>
-              <w:right w:w="100" w:type="dxa"/>
-            </w:tcMar>
-          </w:tcPr>
-          <w:p>
-            <w:r>
-              <w:rPr>
-                <w:sz w:val="18"/>
-              </w:rPr>
-              <w:t>0.9000</w:t>
-            </w:r>
-          </w:p>
-        </w:tc>
-        <w:tc>
-          <w:tcPr>
-            <w:tcW w:type="dxa" w:w="1584"/>
-            <w:shd w:fill="F2F5FA"/>
-            <w:tcMar>
-              <w:top w:w="80" w:type="dxa"/>
-              <w:bottom w:w="80" w:type="dxa"/>
-              <w:left w:w="100" w:type="dxa"/>
-              <w:right w:w="100" w:type="dxa"/>
-            </w:tcMar>
-          </w:tcPr>
-          <w:p>
-            <w:r>
-              <w:rPr>
-                <w:sz w:val="18"/>
-              </w:rPr>
-              <w:t>78.9% ± 2.5%</w:t>
-            </w:r>
-          </w:p>
-        </w:tc>
-      </w:tr>
-      <w:tr>
-        <w:tc>
-          <w:tcPr>
-            <w:tcW w:type="dxa" w:w="2592"/>
-            <w:tcMar>
-              <w:top w:w="80" w:type="dxa"/>
-              <w:bottom w:w="80" w:type="dxa"/>
-              <w:left w:w="100" w:type="dxa"/>
-              <w:right w:w="100" w:type="dxa"/>
-            </w:tcMar>
-          </w:tcPr>
-          <w:p>
-            <w:r>
-              <w:rPr>
-                <w:sz w:val="18"/>
-              </w:rPr>
-              <w:t>Gaussian_Naive_Bayes</w:t>
+              <w:t>Logistic_Regression_ElasticNet</w:t>
             </w:r>
           </w:p>
         </w:tc>
@@ -2287,7 +2273,7 @@
               <w:rPr>
                 <w:sz w:val="18"/>
               </w:rPr>
-              <w:t>96.43%</w:t>
+              <w:t>92.86%</w:t>
             </w:r>
           </w:p>
         </w:tc>
@@ -2306,7 +2292,7 @@
               <w:rPr>
                 <w:sz w:val="18"/>
               </w:rPr>
-              <w:t>78.79%</w:t>
+              <w:t>81.82%</w:t>
             </w:r>
           </w:p>
         </w:tc>
@@ -2325,7 +2311,7 @@
               <w:rPr>
                 <w:sz w:val="18"/>
               </w:rPr>
-              <w:t>0.8710</w:t>
+              <w:t>0.8667</w:t>
             </w:r>
           </w:p>
         </w:tc>
@@ -2344,7 +2330,7 @@
               <w:rPr>
                 <w:sz w:val="18"/>
               </w:rPr>
-              <w:t>81.8% ± 3.1%</w:t>
+              <w:t>82.6% ± 1.7%</w:t>
             </w:r>
           </w:p>
         </w:tc>
@@ -2366,7 +2352,7 @@
               <w:rPr>
                 <w:sz w:val="18"/>
               </w:rPr>
-              <w:t>Logistic_Regression_ElasticNet</w:t>
+              <w:t>Gaussian_Naive_Bayes</w:t>
             </w:r>
           </w:p>
         </w:tc>
@@ -2426,7 +2412,7 @@
               <w:rPr>
                 <w:sz w:val="18"/>
               </w:rPr>
-              <w:t>92.86%</w:t>
+              <w:t>96.43%</w:t>
             </w:r>
           </w:p>
         </w:tc>
@@ -2446,7 +2432,7 @@
               <w:rPr>
                 <w:sz w:val="18"/>
               </w:rPr>
-              <w:t>81.82%</w:t>
+              <w:t>78.79%</w:t>
             </w:r>
           </w:p>
         </w:tc>
@@ -2466,7 +2452,7 @@
               <w:rPr>
                 <w:sz w:val="18"/>
               </w:rPr>
-              <w:t>0.8667</w:t>
+              <w:t>0.8710</w:t>
             </w:r>
           </w:p>
         </w:tc>
@@ -2486,7 +2472,7 @@
               <w:rPr>
                 <w:sz w:val="18"/>
               </w:rPr>
-              <w:t>82.6% ± 1.7%</w:t>
+              <w:t>81.8% ± 3.1%</w:t>
             </w:r>
           </w:p>
         </w:tc>
@@ -2643,7 +2629,7 @@
               <w:rPr>
                 <w:sz w:val="18"/>
               </w:rPr>
-              <w:t>SVM_RBF</w:t>
+              <w:t>Extra_Trees</w:t>
             </w:r>
           </w:p>
         </w:tc>
@@ -2663,7 +2649,7 @@
               <w:rPr>
                 <w:sz w:val="18"/>
               </w:rPr>
-              <w:t>94.70%</w:t>
+              <w:t>94.59%</w:t>
             </w:r>
           </w:p>
         </w:tc>
@@ -2703,7 +2689,7 @@
               <w:rPr>
                 <w:sz w:val="18"/>
               </w:rPr>
-              <w:t>89.29%</w:t>
+              <w:t>96.43%</w:t>
             </w:r>
           </w:p>
         </w:tc>
@@ -2723,7 +2709,7 @@
               <w:rPr>
                 <w:sz w:val="18"/>
               </w:rPr>
-              <w:t>81.82%</w:t>
+              <w:t>75.76%</w:t>
             </w:r>
           </w:p>
         </w:tc>
@@ -2743,7 +2729,7 @@
               <w:rPr>
                 <w:sz w:val="18"/>
               </w:rPr>
-              <w:t>0.8475</w:t>
+              <w:t>0.8571</w:t>
             </w:r>
           </w:p>
         </w:tc>
@@ -2763,7 +2749,7 @@
               <w:rPr>
                 <w:sz w:val="18"/>
               </w:rPr>
-              <w:t>82.6% ± 3.1%</w:t>
+              <w:t>81.8% ± 2.0%</w:t>
             </w:r>
           </w:p>
         </w:tc>
@@ -2784,7 +2770,7 @@
               <w:rPr>
                 <w:sz w:val="18"/>
               </w:rPr>
-              <w:t>Extra_Trees</w:t>
+              <w:t>SVM_RBF</w:t>
             </w:r>
           </w:p>
         </w:tc>
@@ -2803,7 +2789,7 @@
               <w:rPr>
                 <w:sz w:val="18"/>
               </w:rPr>
-              <w:t>94.59%</w:t>
+              <w:t>94.48%</w:t>
             </w:r>
           </w:p>
         </w:tc>
@@ -2841,7 +2827,7 @@
               <w:rPr>
                 <w:sz w:val="18"/>
               </w:rPr>
-              <w:t>96.43%</w:t>
+              <w:t>89.29%</w:t>
             </w:r>
           </w:p>
         </w:tc>
@@ -2860,7 +2846,7 @@
               <w:rPr>
                 <w:sz w:val="18"/>
               </w:rPr>
-              <w:t>75.76%</w:t>
+              <w:t>81.82%</w:t>
             </w:r>
           </w:p>
         </w:tc>
@@ -2879,7 +2865,7 @@
               <w:rPr>
                 <w:sz w:val="18"/>
               </w:rPr>
-              <w:t>0.8571</w:t>
+              <w:t>0.8475</w:t>
             </w:r>
           </w:p>
         </w:tc>
@@ -2898,7 +2884,7 @@
               <w:rPr>
                 <w:sz w:val="18"/>
               </w:rPr>
-              <w:t>81.8% ± 2.0%</w:t>
+              <w:t>83.5% ± 2.9%</w:t>
             </w:r>
           </w:p>
         </w:tc>
@@ -3061,7 +3047,7 @@
               <w:rPr>
                 <w:sz w:val="18"/>
               </w:rPr>
-              <w:t>SVM_Linear</w:t>
+              <w:t>XGBoost</w:t>
             </w:r>
           </w:p>
         </w:tc>
@@ -3080,7 +3066,7 @@
               <w:rPr>
                 <w:sz w:val="18"/>
               </w:rPr>
-              <w:t>94.26%</w:t>
+              <w:t>94.48%</w:t>
             </w:r>
           </w:p>
         </w:tc>
@@ -3099,7 +3085,7 @@
               <w:rPr>
                 <w:sz w:val="18"/>
               </w:rPr>
-              <w:t>85.25%</w:t>
+              <w:t>88.52%</w:t>
             </w:r>
           </w:p>
         </w:tc>
@@ -3137,7 +3123,7 @@
               <w:rPr>
                 <w:sz w:val="18"/>
               </w:rPr>
-              <w:t>81.82%</w:t>
+              <w:t>87.88%</w:t>
             </w:r>
           </w:p>
         </w:tc>
@@ -3156,7 +3142,7 @@
               <w:rPr>
                 <w:sz w:val="18"/>
               </w:rPr>
-              <w:t>0.8475</w:t>
+              <w:t>0.8772</w:t>
             </w:r>
           </w:p>
         </w:tc>
@@ -3175,7 +3161,7 @@
               <w:rPr>
                 <w:sz w:val="18"/>
               </w:rPr>
-              <w:t>81.0% ± 2.9%</w:t>
+              <w:t>82.2% ± 4.4%</w:t>
             </w:r>
           </w:p>
         </w:tc>
@@ -3197,7 +3183,7 @@
               <w:rPr>
                 <w:sz w:val="18"/>
               </w:rPr>
-              <w:t>XGBoost</w:t>
+              <w:t>SVM_Linear</w:t>
             </w:r>
           </w:p>
         </w:tc>
@@ -3217,7 +3203,7 @@
               <w:rPr>
                 <w:sz w:val="18"/>
               </w:rPr>
-              <w:t>94.05%</w:t>
+              <w:t>94.26%</w:t>
             </w:r>
           </w:p>
         </w:tc>
@@ -3257,7 +3243,7 @@
               <w:rPr>
                 <w:sz w:val="18"/>
               </w:rPr>
-              <w:t>92.86%</w:t>
+              <w:t>89.29%</w:t>
             </w:r>
           </w:p>
         </w:tc>
@@ -3277,7 +3263,7 @@
               <w:rPr>
                 <w:sz w:val="18"/>
               </w:rPr>
-              <w:t>78.79%</w:t>
+              <w:t>81.82%</w:t>
             </w:r>
           </w:p>
         </w:tc>
@@ -3297,7 +3283,7 @@
               <w:rPr>
                 <w:sz w:val="18"/>
               </w:rPr>
-              <w:t>0.8525</w:t>
+              <w:t>0.8475</w:t>
             </w:r>
           </w:p>
         </w:tc>
@@ -3317,7 +3303,7 @@
               <w:rPr>
                 <w:sz w:val="18"/>
               </w:rPr>
-              <w:t>77.7% ± 3.6%</w:t>
+              <w:t>81.0% ± 2.9%</w:t>
             </w:r>
           </w:p>
         </w:tc>
@@ -3338,7 +3324,7 @@
               <w:rPr>
                 <w:sz w:val="18"/>
               </w:rPr>
-              <w:t>Gradient_Boosting</w:t>
+              <w:t>CatBoost</w:t>
             </w:r>
           </w:p>
         </w:tc>
@@ -3357,7 +3343,7 @@
               <w:rPr>
                 <w:sz w:val="18"/>
               </w:rPr>
-              <w:t>93.94%</w:t>
+              <w:t>94.26%</w:t>
             </w:r>
           </w:p>
         </w:tc>
@@ -3376,7 +3362,7 @@
               <w:rPr>
                 <w:sz w:val="18"/>
               </w:rPr>
-              <w:t>81.97%</w:t>
+              <w:t>83.61%</w:t>
             </w:r>
           </w:p>
         </w:tc>
@@ -3395,7 +3381,7 @@
               <w:rPr>
                 <w:sz w:val="18"/>
               </w:rPr>
-              <w:t>92.86%</w:t>
+              <w:t>85.71%</w:t>
             </w:r>
           </w:p>
         </w:tc>
@@ -3414,7 +3400,7 @@
               <w:rPr>
                 <w:sz w:val="18"/>
               </w:rPr>
-              <w:t>72.73%</w:t>
+              <w:t>81.82%</w:t>
             </w:r>
           </w:p>
         </w:tc>
@@ -3433,7 +3419,7 @@
               <w:rPr>
                 <w:sz w:val="18"/>
               </w:rPr>
-              <w:t>0.8254</w:t>
+              <w:t>0.8276</w:t>
             </w:r>
           </w:p>
         </w:tc>
@@ -3452,7 +3438,7 @@
               <w:rPr>
                 <w:sz w:val="18"/>
               </w:rPr>
-              <w:t>78.5% ± 2.5%</w:t>
+              <w:t>82.2% ± 3.5%</w:t>
             </w:r>
           </w:p>
         </w:tc>
@@ -3474,7 +3460,7 @@
               <w:rPr>
                 <w:sz w:val="18"/>
               </w:rPr>
-              <w:t>Linear_Discriminant_Analysis</w:t>
+              <w:t>Gradient_Boosting</w:t>
             </w:r>
           </w:p>
         </w:tc>
@@ -3514,7 +3500,7 @@
               <w:rPr>
                 <w:sz w:val="18"/>
               </w:rPr>
-              <w:t>83.61%</w:t>
+              <w:t>81.97%</w:t>
             </w:r>
           </w:p>
         </w:tc>
@@ -3534,7 +3520,284 @@
               <w:rPr>
                 <w:sz w:val="18"/>
               </w:rPr>
+              <w:t>92.86%</w:t>
+            </w:r>
+          </w:p>
+        </w:tc>
+        <w:tc>
+          <w:tcPr>
+            <w:tcW w:type="dxa" w:w="1152"/>
+            <w:shd w:fill="F2F5FA"/>
+            <w:tcMar>
+              <w:top w:w="80" w:type="dxa"/>
+              <w:bottom w:w="80" w:type="dxa"/>
+              <w:left w:w="100" w:type="dxa"/>
+              <w:right w:w="100" w:type="dxa"/>
+            </w:tcMar>
+          </w:tcPr>
+          <w:p>
+            <w:r>
+              <w:rPr>
+                <w:sz w:val="18"/>
+              </w:rPr>
+              <w:t>72.73%</w:t>
+            </w:r>
+          </w:p>
+        </w:tc>
+        <w:tc>
+          <w:tcPr>
+            <w:tcW w:type="dxa" w:w="1152"/>
+            <w:shd w:fill="F2F5FA"/>
+            <w:tcMar>
+              <w:top w:w="80" w:type="dxa"/>
+              <w:bottom w:w="80" w:type="dxa"/>
+              <w:left w:w="100" w:type="dxa"/>
+              <w:right w:w="100" w:type="dxa"/>
+            </w:tcMar>
+          </w:tcPr>
+          <w:p>
+            <w:r>
+              <w:rPr>
+                <w:sz w:val="18"/>
+              </w:rPr>
+              <w:t>0.8254</w:t>
+            </w:r>
+          </w:p>
+        </w:tc>
+        <w:tc>
+          <w:tcPr>
+            <w:tcW w:type="dxa" w:w="1584"/>
+            <w:shd w:fill="F2F5FA"/>
+            <w:tcMar>
+              <w:top w:w="80" w:type="dxa"/>
+              <w:bottom w:w="80" w:type="dxa"/>
+              <w:left w:w="100" w:type="dxa"/>
+              <w:right w:w="100" w:type="dxa"/>
+            </w:tcMar>
+          </w:tcPr>
+          <w:p>
+            <w:r>
+              <w:rPr>
+                <w:sz w:val="18"/>
+              </w:rPr>
+              <w:t>78.5% ± 2.5%</w:t>
+            </w:r>
+          </w:p>
+        </w:tc>
+      </w:tr>
+      <w:tr>
+        <w:tc>
+          <w:tcPr>
+            <w:tcW w:type="dxa" w:w="2592"/>
+            <w:tcMar>
+              <w:top w:w="80" w:type="dxa"/>
+              <w:bottom w:w="80" w:type="dxa"/>
+              <w:left w:w="100" w:type="dxa"/>
+              <w:right w:w="100" w:type="dxa"/>
+            </w:tcMar>
+          </w:tcPr>
+          <w:p>
+            <w:r>
+              <w:rPr>
+                <w:sz w:val="18"/>
+              </w:rPr>
+              <w:t>Linear_Discriminant_Analysis</w:t>
+            </w:r>
+          </w:p>
+        </w:tc>
+        <w:tc>
+          <w:tcPr>
+            <w:tcW w:type="dxa" w:w="1152"/>
+            <w:tcMar>
+              <w:top w:w="80" w:type="dxa"/>
+              <w:bottom w:w="80" w:type="dxa"/>
+              <w:left w:w="100" w:type="dxa"/>
+              <w:right w:w="100" w:type="dxa"/>
+            </w:tcMar>
+          </w:tcPr>
+          <w:p>
+            <w:r>
+              <w:rPr>
+                <w:sz w:val="18"/>
+              </w:rPr>
+              <w:t>93.94%</w:t>
+            </w:r>
+          </w:p>
+        </w:tc>
+        <w:tc>
+          <w:tcPr>
+            <w:tcW w:type="dxa" w:w="1152"/>
+            <w:tcMar>
+              <w:top w:w="80" w:type="dxa"/>
+              <w:bottom w:w="80" w:type="dxa"/>
+              <w:left w:w="100" w:type="dxa"/>
+              <w:right w:w="100" w:type="dxa"/>
+            </w:tcMar>
+          </w:tcPr>
+          <w:p>
+            <w:r>
+              <w:rPr>
+                <w:sz w:val="18"/>
+              </w:rPr>
+              <w:t>83.61%</w:t>
+            </w:r>
+          </w:p>
+        </w:tc>
+        <w:tc>
+          <w:tcPr>
+            <w:tcW w:type="dxa" w:w="1296"/>
+            <w:tcMar>
+              <w:top w:w="80" w:type="dxa"/>
+              <w:bottom w:w="80" w:type="dxa"/>
+              <w:left w:w="100" w:type="dxa"/>
+              <w:right w:w="100" w:type="dxa"/>
+            </w:tcMar>
+          </w:tcPr>
+          <w:p>
+            <w:r>
+              <w:rPr>
+                <w:sz w:val="18"/>
+              </w:rPr>
               <w:t>85.71%</w:t>
+            </w:r>
+          </w:p>
+        </w:tc>
+        <w:tc>
+          <w:tcPr>
+            <w:tcW w:type="dxa" w:w="1152"/>
+            <w:tcMar>
+              <w:top w:w="80" w:type="dxa"/>
+              <w:bottom w:w="80" w:type="dxa"/>
+              <w:left w:w="100" w:type="dxa"/>
+              <w:right w:w="100" w:type="dxa"/>
+            </w:tcMar>
+          </w:tcPr>
+          <w:p>
+            <w:r>
+              <w:rPr>
+                <w:sz w:val="18"/>
+              </w:rPr>
+              <w:t>81.82%</w:t>
+            </w:r>
+          </w:p>
+        </w:tc>
+        <w:tc>
+          <w:tcPr>
+            <w:tcW w:type="dxa" w:w="1152"/>
+            <w:tcMar>
+              <w:top w:w="80" w:type="dxa"/>
+              <w:bottom w:w="80" w:type="dxa"/>
+              <w:left w:w="100" w:type="dxa"/>
+              <w:right w:w="100" w:type="dxa"/>
+            </w:tcMar>
+          </w:tcPr>
+          <w:p>
+            <w:r>
+              <w:rPr>
+                <w:sz w:val="18"/>
+              </w:rPr>
+              <w:t>0.8276</w:t>
+            </w:r>
+          </w:p>
+        </w:tc>
+        <w:tc>
+          <w:tcPr>
+            <w:tcW w:type="dxa" w:w="1584"/>
+            <w:tcMar>
+              <w:top w:w="80" w:type="dxa"/>
+              <w:bottom w:w="80" w:type="dxa"/>
+              <w:left w:w="100" w:type="dxa"/>
+              <w:right w:w="100" w:type="dxa"/>
+            </w:tcMar>
+          </w:tcPr>
+          <w:p>
+            <w:r>
+              <w:rPr>
+                <w:sz w:val="18"/>
+              </w:rPr>
+              <w:t>83.5% ± 2.7%</w:t>
+            </w:r>
+          </w:p>
+        </w:tc>
+      </w:tr>
+      <w:tr>
+        <w:tc>
+          <w:tcPr>
+            <w:tcW w:type="dxa" w:w="2592"/>
+            <w:shd w:fill="F2F5FA"/>
+            <w:tcMar>
+              <w:top w:w="80" w:type="dxa"/>
+              <w:bottom w:w="80" w:type="dxa"/>
+              <w:left w:w="100" w:type="dxa"/>
+              <w:right w:w="100" w:type="dxa"/>
+            </w:tcMar>
+          </w:tcPr>
+          <w:p>
+            <w:r>
+              <w:rPr>
+                <w:sz w:val="18"/>
+              </w:rPr>
+              <w:t>KNN_Classifier</w:t>
+            </w:r>
+          </w:p>
+        </w:tc>
+        <w:tc>
+          <w:tcPr>
+            <w:tcW w:type="dxa" w:w="1152"/>
+            <w:shd w:fill="F2F5FA"/>
+            <w:tcMar>
+              <w:top w:w="80" w:type="dxa"/>
+              <w:bottom w:w="80" w:type="dxa"/>
+              <w:left w:w="100" w:type="dxa"/>
+              <w:right w:w="100" w:type="dxa"/>
+            </w:tcMar>
+          </w:tcPr>
+          <w:p>
+            <w:r>
+              <w:rPr>
+                <w:sz w:val="18"/>
+              </w:rPr>
+              <w:t>92.42%</w:t>
+            </w:r>
+          </w:p>
+        </w:tc>
+        <w:tc>
+          <w:tcPr>
+            <w:tcW w:type="dxa" w:w="1152"/>
+            <w:shd w:fill="F2F5FA"/>
+            <w:tcMar>
+              <w:top w:w="80" w:type="dxa"/>
+              <w:bottom w:w="80" w:type="dxa"/>
+              <w:left w:w="100" w:type="dxa"/>
+              <w:right w:w="100" w:type="dxa"/>
+            </w:tcMar>
+          </w:tcPr>
+          <w:p>
+            <w:r>
+              <w:rPr>
+                <w:sz w:val="18"/>
+              </w:rPr>
+              <w:t>90.16%</w:t>
+            </w:r>
+          </w:p>
+        </w:tc>
+        <w:tc>
+          <w:tcPr>
+            <w:tcW w:type="dxa" w:w="1296"/>
+            <w:shd w:fill="F2F5FA"/>
+            <w:tcMar>
+              <w:top w:w="80" w:type="dxa"/>
+              <w:bottom w:w="80" w:type="dxa"/>
+              <w:left w:w="100" w:type="dxa"/>
+              <w:right w:w="100" w:type="dxa"/>
+            </w:tcMar>
+          </w:tcPr>
+          <w:p>
+            <w:r>
+              <w:rPr>
+                <w:sz w:val="18"/>
+              </w:rPr>
+              <w:t>100.00%</w:t>
             </w:r>
           </w:p>
         </w:tc>
@@ -3574,7 +3837,7 @@
               <w:rPr>
                 <w:sz w:val="18"/>
               </w:rPr>
-              <w:t>0.8276</w:t>
+              <w:t>0.9032</w:t>
             </w:r>
           </w:p>
         </w:tc>
@@ -3582,141 +3845,6 @@
           <w:tcPr>
             <w:tcW w:type="dxa" w:w="1584"/>
             <w:shd w:fill="F2F5FA"/>
-            <w:tcMar>
-              <w:top w:w="80" w:type="dxa"/>
-              <w:bottom w:w="80" w:type="dxa"/>
-              <w:left w:w="100" w:type="dxa"/>
-              <w:right w:w="100" w:type="dxa"/>
-            </w:tcMar>
-          </w:tcPr>
-          <w:p>
-            <w:r>
-              <w:rPr>
-                <w:sz w:val="18"/>
-              </w:rPr>
-              <w:t>83.5% ± 2.7%</w:t>
-            </w:r>
-          </w:p>
-        </w:tc>
-      </w:tr>
-      <w:tr>
-        <w:tc>
-          <w:tcPr>
-            <w:tcW w:type="dxa" w:w="2592"/>
-            <w:tcMar>
-              <w:top w:w="80" w:type="dxa"/>
-              <w:bottom w:w="80" w:type="dxa"/>
-              <w:left w:w="100" w:type="dxa"/>
-              <w:right w:w="100" w:type="dxa"/>
-            </w:tcMar>
-          </w:tcPr>
-          <w:p>
-            <w:r>
-              <w:rPr>
-                <w:sz w:val="18"/>
-              </w:rPr>
-              <w:t>KNN_Classifier</w:t>
-            </w:r>
-          </w:p>
-        </w:tc>
-        <w:tc>
-          <w:tcPr>
-            <w:tcW w:type="dxa" w:w="1152"/>
-            <w:tcMar>
-              <w:top w:w="80" w:type="dxa"/>
-              <w:bottom w:w="80" w:type="dxa"/>
-              <w:left w:w="100" w:type="dxa"/>
-              <w:right w:w="100" w:type="dxa"/>
-            </w:tcMar>
-          </w:tcPr>
-          <w:p>
-            <w:r>
-              <w:rPr>
-                <w:sz w:val="18"/>
-              </w:rPr>
-              <w:t>92.42%</w:t>
-            </w:r>
-          </w:p>
-        </w:tc>
-        <w:tc>
-          <w:tcPr>
-            <w:tcW w:type="dxa" w:w="1152"/>
-            <w:tcMar>
-              <w:top w:w="80" w:type="dxa"/>
-              <w:bottom w:w="80" w:type="dxa"/>
-              <w:left w:w="100" w:type="dxa"/>
-              <w:right w:w="100" w:type="dxa"/>
-            </w:tcMar>
-          </w:tcPr>
-          <w:p>
-            <w:r>
-              <w:rPr>
-                <w:sz w:val="18"/>
-              </w:rPr>
-              <w:t>90.16%</w:t>
-            </w:r>
-          </w:p>
-        </w:tc>
-        <w:tc>
-          <w:tcPr>
-            <w:tcW w:type="dxa" w:w="1296"/>
-            <w:tcMar>
-              <w:top w:w="80" w:type="dxa"/>
-              <w:bottom w:w="80" w:type="dxa"/>
-              <w:left w:w="100" w:type="dxa"/>
-              <w:right w:w="100" w:type="dxa"/>
-            </w:tcMar>
-          </w:tcPr>
-          <w:p>
-            <w:r>
-              <w:rPr>
-                <w:sz w:val="18"/>
-              </w:rPr>
-              <w:t>100.00%</w:t>
-            </w:r>
-          </w:p>
-        </w:tc>
-        <w:tc>
-          <w:tcPr>
-            <w:tcW w:type="dxa" w:w="1152"/>
-            <w:tcMar>
-              <w:top w:w="80" w:type="dxa"/>
-              <w:bottom w:w="80" w:type="dxa"/>
-              <w:left w:w="100" w:type="dxa"/>
-              <w:right w:w="100" w:type="dxa"/>
-            </w:tcMar>
-          </w:tcPr>
-          <w:p>
-            <w:r>
-              <w:rPr>
-                <w:sz w:val="18"/>
-              </w:rPr>
-              <w:t>81.82%</w:t>
-            </w:r>
-          </w:p>
-        </w:tc>
-        <w:tc>
-          <w:tcPr>
-            <w:tcW w:type="dxa" w:w="1152"/>
-            <w:tcMar>
-              <w:top w:w="80" w:type="dxa"/>
-              <w:bottom w:w="80" w:type="dxa"/>
-              <w:left w:w="100" w:type="dxa"/>
-              <w:right w:w="100" w:type="dxa"/>
-            </w:tcMar>
-          </w:tcPr>
-          <w:p>
-            <w:r>
-              <w:rPr>
-                <w:sz w:val="18"/>
-              </w:rPr>
-              <w:t>0.9032</w:t>
-            </w:r>
-          </w:p>
-        </w:tc>
-        <w:tc>
-          <w:tcPr>
-            <w:tcW w:type="dxa" w:w="1584"/>
             <w:tcMar>
               <w:top w:w="80" w:type="dxa"/>
               <w:bottom w:w="80" w:type="dxa"/>
@@ -3738,7 +3866,6 @@
         <w:tc>
           <w:tcPr>
             <w:tcW w:type="dxa" w:w="2592"/>
-            <w:shd w:fill="F2F5FA"/>
             <w:tcMar>
               <w:top w:w="80" w:type="dxa"/>
               <w:bottom w:w="80" w:type="dxa"/>
@@ -3758,7 +3885,6 @@
         <w:tc>
           <w:tcPr>
             <w:tcW w:type="dxa" w:w="1152"/>
-            <w:shd w:fill="F2F5FA"/>
             <w:tcMar>
               <w:top w:w="80" w:type="dxa"/>
               <w:bottom w:w="80" w:type="dxa"/>
@@ -3778,7 +3904,6 @@
         <w:tc>
           <w:tcPr>
             <w:tcW w:type="dxa" w:w="1152"/>
-            <w:shd w:fill="F2F5FA"/>
             <w:tcMar>
               <w:top w:w="80" w:type="dxa"/>
               <w:bottom w:w="80" w:type="dxa"/>
@@ -3798,7 +3923,6 @@
         <w:tc>
           <w:tcPr>
             <w:tcW w:type="dxa" w:w="1296"/>
-            <w:shd w:fill="F2F5FA"/>
             <w:tcMar>
               <w:top w:w="80" w:type="dxa"/>
               <w:bottom w:w="80" w:type="dxa"/>
@@ -3818,7 +3942,6 @@
         <w:tc>
           <w:tcPr>
             <w:tcW w:type="dxa" w:w="1152"/>
-            <w:shd w:fill="F2F5FA"/>
             <w:tcMar>
               <w:top w:w="80" w:type="dxa"/>
               <w:bottom w:w="80" w:type="dxa"/>
@@ -3838,7 +3961,6 @@
         <w:tc>
           <w:tcPr>
             <w:tcW w:type="dxa" w:w="1152"/>
-            <w:shd w:fill="F2F5FA"/>
             <w:tcMar>
               <w:top w:w="80" w:type="dxa"/>
               <w:bottom w:w="80" w:type="dxa"/>
@@ -3858,7 +3980,6 @@
         <w:tc>
           <w:tcPr>
             <w:tcW w:type="dxa" w:w="1584"/>
-            <w:shd w:fill="F2F5FA"/>
             <w:tcMar>
               <w:top w:w="80" w:type="dxa"/>
               <w:bottom w:w="80" w:type="dxa"/>

</xml_diff>